<commit_message>
ADD CV to portoflio
</commit_message>
<xml_diff>
--- a/ Veer CV .docx
+++ b/ Veer CV .docx
@@ -2,15 +2,788 @@
 <file path=word/document.xml><?xml version="1.0" encoding="utf-8"?>
 <w:document xmlns:wpc="http://schemas.microsoft.com/office/word/2010/wordprocessingCanvas" xmlns:cx="http://schemas.microsoft.com/office/drawing/2014/chartex" xmlns:cx1="http://schemas.microsoft.com/office/drawing/2015/9/8/chartex" xmlns:cx2="http://schemas.microsoft.com/office/drawing/2015/10/21/chartex" xmlns:cx3="http://schemas.microsoft.com/office/drawing/2016/5/9/chartex" xmlns:cx4="http://schemas.microsoft.com/office/drawing/2016/5/10/chartex" xmlns:cx5="http://schemas.microsoft.com/office/drawing/2016/5/11/chartex" xmlns:cx6="http://schemas.microsoft.com/office/drawing/2016/5/12/chartex" xmlns:cx7="http://schemas.microsoft.com/office/drawing/2016/5/13/chartex" xmlns:cx8="http://schemas.microsoft.com/office/drawing/2016/5/14/chartex" xmlns:mc="http://schemas.openxmlformats.org/markup-compatibility/2006" xmlns:m="http://schemas.openxmlformats.org/officeDocument/2006/math" xmlns:aink="http://schemas.microsoft.com/office/drawing/2016/ink" xmlns:am3d="http://schemas.microsoft.com/office/drawing/2017/model3d" xmlns:oel="http://schemas.microsoft.com/office/2019/extlst" xmlns:r="http://schemas.openxmlformats.org/officeDocument/2006/relationships" xmlns:wp14="http://schemas.microsoft.com/office/word/2010/wordprocessingDrawing" xmlns:wp="http://schemas.openxmlformats.org/drawingml/2006/wordprocessingDrawing" xmlns:wpg="http://schemas.microsoft.com/office/word/2010/wordprocessingGroup" xmlns:wpi="http://schemas.microsoft.com/office/word/2010/wordprocessingInk" xmlns:wps="http://schemas.microsoft.com/office/word/2010/wordprocessingShape" xmlns:o="urn:schemas-microsoft-com:office:office" xmlns:v="urn:schemas-microsoft-com:vml" xmlns:w10="urn:schemas-microsoft-com:office:word" xmlns:w="http://schemas.openxmlformats.org/wordprocessingml/2006/main" xmlns:w14="http://schemas.microsoft.com/office/word/2010/wordml" xmlns:w15="http://schemas.microsoft.com/office/word/2012/wordml" xmlns:w16cex="http://schemas.microsoft.com/office/word/2018/wordml/cex" xmlns:w16cid="http://schemas.microsoft.com/office/word/2016/wordml/cid" xmlns:w16="http://schemas.microsoft.com/office/word/2018/wordml" xmlns:w16sdtdh="http://schemas.microsoft.com/office/word/2020/wordml/sdtdatahash" xmlns:w16sdtfl="http://schemas.microsoft.com/office/word/2024/wordml/sdtformatlock" xmlns:w16se="http://schemas.microsoft.com/office/word/2015/wordml/symex" xmlns:w16du="http://schemas.microsoft.com/office/word/2023/wordml/word16du" xmlns:wne="http://schemas.microsoft.com/office/word/2006/wordml" mc:Ignorable="w14 w15 w16se w16cid w16 w16cex w16sdtdh w16sdtfl w16du wp14">
   <w:body>
-    <w:bookmarkStart w:id="0" w:name="_Hlk131061553"/>
     <w:p>
       <w:pPr>
         <w:pStyle w:val="Title"/>
         <w:spacing w:before="0" w:after="0" w:line="240" w:lineRule="auto"/>
+        <w:ind w:left="0"/>
         <w:rPr>
           <w:sz w:val="6"/>
           <w:szCs w:val="6"/>
         </w:rPr>
+      </w:pPr>
+      <w:bookmarkStart w:id="0" w:name="_Hlk131061553"/>
+    </w:p>
+    <w:p>
+      <w:pPr>
+        <w:pStyle w:val="Title"/>
+      </w:pPr>
+      <w:r>
+        <w:t>Veer Rana</w:t>
+      </w:r>
+    </w:p>
+    <w:p>
+      <w:proofErr w:type="spellStart"/>
+      <w:proofErr w:type="gramStart"/>
+      <w:r>
+        <w:t>Leicester,UK</w:t>
+      </w:r>
+      <w:proofErr w:type="spellEnd"/>
+      <w:proofErr w:type="gramEnd"/>
+      <w:r>
+        <w:t>|+44</w:t>
+      </w:r>
+      <w:r>
+        <w:t xml:space="preserve"> 7417361262</w:t>
+      </w:r>
+    </w:p>
+    <w:p>
+      <w:r>
+        <w:t>r</w:t>
+      </w:r>
+      <w:r>
+        <w:t>anaveer2525@gmail.com</w:t>
+      </w:r>
+    </w:p>
+    <w:p>
+      <w:hyperlink r:id="rId11" w:history="1">
+        <w:r>
+          <w:rPr>
+            <w:rStyle w:val="Hyperlink"/>
+          </w:rPr>
+          <w:t>Linke</w:t>
+        </w:r>
+        <w:r>
+          <w:rPr>
+            <w:rStyle w:val="Hyperlink"/>
+          </w:rPr>
+          <w:t>d</w:t>
+        </w:r>
+        <w:r>
+          <w:rPr>
+            <w:rStyle w:val="Hyperlink"/>
+          </w:rPr>
+          <w:t>In</w:t>
+        </w:r>
+      </w:hyperlink>
+      <w:r>
+        <w:t xml:space="preserve"> | </w:t>
+      </w:r>
+      <w:hyperlink r:id="rId12" w:history="1">
+        <w:r>
+          <w:rPr>
+            <w:rStyle w:val="Hyperlink"/>
+          </w:rPr>
+          <w:t>GitH</w:t>
+        </w:r>
+        <w:r>
+          <w:rPr>
+            <w:rStyle w:val="Hyperlink"/>
+          </w:rPr>
+          <w:t>u</w:t>
+        </w:r>
+        <w:r>
+          <w:rPr>
+            <w:rStyle w:val="Hyperlink"/>
+          </w:rPr>
+          <w:t>b</w:t>
+        </w:r>
+      </w:hyperlink>
+      <w:r>
+        <w:t xml:space="preserve"> | </w:t>
+      </w:r>
+      <w:hyperlink r:id="rId13" w:history="1">
+        <w:r>
+          <w:rPr>
+            <w:rStyle w:val="Hyperlink"/>
+          </w:rPr>
+          <w:t>Portfoli</w:t>
+        </w:r>
+        <w:r>
+          <w:rPr>
+            <w:rStyle w:val="Hyperlink"/>
+          </w:rPr>
+          <w:t>o</w:t>
+        </w:r>
+      </w:hyperlink>
+    </w:p>
+    <w:p>
+      <w:pPr>
+        <w:pStyle w:val="Subtitle"/>
+      </w:pPr>
+    </w:p>
+    <w:p>
+      <w:pPr>
+        <w:pStyle w:val="Subtitle"/>
+      </w:pPr>
+    </w:p>
+    <w:p>
+      <w:pPr>
+        <w:pStyle w:val="Subtitle"/>
+      </w:pPr>
+      <w:r>
+        <w:t xml:space="preserve">About me </w:t>
+      </w:r>
+    </w:p>
+    <w:p>
+      <w:pPr>
+        <w:rPr>
+          <w:lang w:bidi="ar-SA"/>
+        </w:rPr>
+      </w:pPr>
+    </w:p>
+    <w:p>
+      <w:pPr>
+        <w:rPr>
+          <w:sz w:val="18"/>
+          <w:szCs w:val="18"/>
+        </w:rPr>
+      </w:pPr>
+      <w:r>
+        <w:rPr>
+          <w:sz w:val="18"/>
+          <w:szCs w:val="18"/>
+        </w:rPr>
+        <w:t>Computer Science student at the University of Leicester with experience developing full-stack applications using Python, C#, SQL, HTML, CSS and JavaScript. Interested in software engineering and full-stack development, with practical experience building web applications and database-driven projects. Seeking a 2027 software engineering placement to apply and develop my technical skills in a professional environment.</w:t>
+      </w:r>
+    </w:p>
+    <w:p/>
+    <w:p>
+      <w:pPr>
+        <w:pStyle w:val="Subtitle"/>
+      </w:pPr>
+      <w:r>
+        <w:t>Projects</w:t>
+      </w:r>
+    </w:p>
+    <w:p>
+      <w:pPr>
+        <w:rPr>
+          <w:lang w:bidi="ar-SA"/>
+        </w:rPr>
+      </w:pPr>
+    </w:p>
+    <w:p>
+      <w:pPr>
+        <w:pStyle w:val="Heading2"/>
+      </w:pPr>
+      <w:r>
+        <w:t>Cricket Game &amp; Player Management System</w:t>
+      </w:r>
+    </w:p>
+    <w:p>
+      <w:pPr>
+        <w:rPr>
+          <w:sz w:val="18"/>
+          <w:szCs w:val="18"/>
+        </w:rPr>
+      </w:pPr>
+      <w:r>
+        <w:rPr>
+          <w:rStyle w:val="Strong"/>
+          <w:sz w:val="18"/>
+          <w:szCs w:val="18"/>
+        </w:rPr>
+        <w:t>C# | Unity | SQLite | SQL</w:t>
+      </w:r>
+    </w:p>
+    <w:p>
+      <w:pPr>
+        <w:pStyle w:val="ListParagraph"/>
+        <w:numPr>
+          <w:ilvl w:val="0"/>
+          <w:numId w:val="26"/>
+        </w:numPr>
+        <w:rPr>
+          <w:sz w:val="18"/>
+          <w:szCs w:val="18"/>
+        </w:rPr>
+      </w:pPr>
+      <w:r>
+        <w:rPr>
+          <w:sz w:val="18"/>
+          <w:szCs w:val="18"/>
+        </w:rPr>
+        <w:t>Developed an interactive 3D cricket game in Unity using C#, implementing gameplay mechanics including ball physics and scoring.</w:t>
+      </w:r>
+    </w:p>
+    <w:p>
+      <w:pPr>
+        <w:pStyle w:val="ListParagraph"/>
+        <w:numPr>
+          <w:ilvl w:val="0"/>
+          <w:numId w:val="26"/>
+        </w:numPr>
+        <w:rPr>
+          <w:sz w:val="18"/>
+          <w:szCs w:val="18"/>
+        </w:rPr>
+      </w:pPr>
+      <w:r>
+        <w:rPr>
+          <w:sz w:val="18"/>
+          <w:szCs w:val="18"/>
+        </w:rPr>
+        <w:t>Built a SQLite-backed player management system supporting user registration/login, persistent scores, match history and a Top 10 leaderboard using SQL queries.</w:t>
+      </w:r>
+    </w:p>
+    <w:p>
+      <w:pPr>
+        <w:pStyle w:val="ListParagraph"/>
+        <w:numPr>
+          <w:ilvl w:val="0"/>
+          <w:numId w:val="26"/>
+        </w:numPr>
+        <w:rPr>
+          <w:sz w:val="18"/>
+          <w:szCs w:val="18"/>
+        </w:rPr>
+      </w:pPr>
+      <w:r>
+        <w:rPr>
+          <w:sz w:val="18"/>
+          <w:szCs w:val="18"/>
+        </w:rPr>
+        <w:t>Implemented session management and a points system to associate gameplay data with individual users and persist player rewards.</w:t>
+      </w:r>
+    </w:p>
+    <w:p>
+      <w:pPr>
+        <w:pStyle w:val="Heading2"/>
+      </w:pPr>
+      <w:proofErr w:type="spellStart"/>
+      <w:r>
+        <w:t>SortStudents</w:t>
+      </w:r>
+      <w:proofErr w:type="spellEnd"/>
+      <w:r>
+        <w:t xml:space="preserve"> — Collaborative Student Household Task Manager</w:t>
+      </w:r>
+    </w:p>
+    <w:p>
+      <w:pPr>
+        <w:rPr>
+          <w:sz w:val="18"/>
+          <w:szCs w:val="18"/>
+        </w:rPr>
+      </w:pPr>
+      <w:r>
+        <w:rPr>
+          <w:rStyle w:val="Strong"/>
+          <w:sz w:val="18"/>
+          <w:szCs w:val="18"/>
+        </w:rPr>
+        <w:t>Python | Django | SQLite | HTML/CSS | JavaScript | Bootstrap | HTMX</w:t>
+      </w:r>
+    </w:p>
+    <w:p>
+      <w:pPr>
+        <w:pStyle w:val="ListParagraph"/>
+        <w:numPr>
+          <w:ilvl w:val="0"/>
+          <w:numId w:val="27"/>
+        </w:numPr>
+        <w:rPr>
+          <w:sz w:val="18"/>
+          <w:szCs w:val="18"/>
+        </w:rPr>
+      </w:pPr>
+      <w:r>
+        <w:rPr>
+          <w:sz w:val="18"/>
+          <w:szCs w:val="18"/>
+        </w:rPr>
+        <w:t>Collaborated as one of five developers to build a Django web application helping students in shared accommodation organise and assign household tasks.</w:t>
+      </w:r>
+    </w:p>
+    <w:p>
+      <w:pPr>
+        <w:pStyle w:val="ListParagraph"/>
+        <w:numPr>
+          <w:ilvl w:val="0"/>
+          <w:numId w:val="27"/>
+        </w:numPr>
+        <w:rPr>
+          <w:sz w:val="18"/>
+          <w:szCs w:val="18"/>
+        </w:rPr>
+      </w:pPr>
+      <w:r>
+        <w:rPr>
+          <w:sz w:val="18"/>
+          <w:szCs w:val="18"/>
+        </w:rPr>
+        <w:t>Developed database-backed functionality for households, student profiles, task assignment, due dates and completion tracking using Django and SQLite.</w:t>
+      </w:r>
+    </w:p>
+    <w:p>
+      <w:pPr>
+        <w:pStyle w:val="ListParagraph"/>
+        <w:numPr>
+          <w:ilvl w:val="0"/>
+          <w:numId w:val="27"/>
+        </w:numPr>
+        <w:rPr>
+          <w:sz w:val="18"/>
+          <w:szCs w:val="18"/>
+        </w:rPr>
+      </w:pPr>
+      <w:r>
+        <w:rPr>
+          <w:sz w:val="18"/>
+          <w:szCs w:val="18"/>
+        </w:rPr>
+        <w:t>Implemented session-based authentication and personalised task views based on the logged-in student and household.</w:t>
+      </w:r>
+    </w:p>
+    <w:p>
+      <w:pPr>
+        <w:pStyle w:val="ListParagraph"/>
+        <w:numPr>
+          <w:ilvl w:val="0"/>
+          <w:numId w:val="27"/>
+        </w:numPr>
+        <w:rPr>
+          <w:sz w:val="18"/>
+          <w:szCs w:val="18"/>
+        </w:rPr>
+      </w:pPr>
+      <w:r>
+        <w:rPr>
+          <w:sz w:val="18"/>
+          <w:szCs w:val="18"/>
+        </w:rPr>
+        <w:t>Used HTMX to asynchronously update task completion status without requiring a full page reload.</w:t>
+      </w:r>
+    </w:p>
+    <w:p>
+      <w:pPr>
+        <w:pStyle w:val="Heading2"/>
+      </w:pPr>
+      <w:proofErr w:type="spellStart"/>
+      <w:r>
+        <w:t>MusicFest</w:t>
+      </w:r>
+      <w:proofErr w:type="spellEnd"/>
+      <w:r>
+        <w:t xml:space="preserve"> 2025 — University Web Development Project</w:t>
+      </w:r>
+    </w:p>
+    <w:p>
+      <w:pPr>
+        <w:rPr>
+          <w:sz w:val="18"/>
+          <w:szCs w:val="18"/>
+        </w:rPr>
+      </w:pPr>
+      <w:r>
+        <w:rPr>
+          <w:rStyle w:val="Strong"/>
+          <w:sz w:val="18"/>
+          <w:szCs w:val="18"/>
+        </w:rPr>
+        <w:t>HTML | CSS | JavaScript</w:t>
+      </w:r>
+    </w:p>
+    <w:p>
+      <w:pPr>
+        <w:pStyle w:val="ListParagraph"/>
+        <w:numPr>
+          <w:ilvl w:val="0"/>
+          <w:numId w:val="28"/>
+        </w:numPr>
+        <w:rPr>
+          <w:sz w:val="18"/>
+          <w:szCs w:val="18"/>
+        </w:rPr>
+      </w:pPr>
+      <w:r>
+        <w:rPr>
+          <w:sz w:val="18"/>
+          <w:szCs w:val="18"/>
+        </w:rPr>
+        <w:t>Designed and developed a responsive multi-page music festival website featuring event information, artist line-up, schedules and ticket booking.</w:t>
+      </w:r>
+    </w:p>
+    <w:p>
+      <w:pPr>
+        <w:pStyle w:val="ListParagraph"/>
+        <w:numPr>
+          <w:ilvl w:val="0"/>
+          <w:numId w:val="28"/>
+        </w:numPr>
+        <w:rPr>
+          <w:sz w:val="18"/>
+          <w:szCs w:val="18"/>
+        </w:rPr>
+      </w:pPr>
+      <w:r>
+        <w:rPr>
+          <w:sz w:val="18"/>
+          <w:szCs w:val="18"/>
+        </w:rPr>
+        <w:t>Implemented JavaScript functionality including schedule filtering, dark/light mode persistence and client-side form validation.</w:t>
+      </w:r>
+    </w:p>
+    <w:p>
+      <w:pPr>
+        <w:pStyle w:val="ListParagraph"/>
+        <w:numPr>
+          <w:ilvl w:val="0"/>
+          <w:numId w:val="28"/>
+        </w:numPr>
+        <w:rPr>
+          <w:sz w:val="18"/>
+          <w:szCs w:val="18"/>
+        </w:rPr>
+      </w:pPr>
+      <w:r>
+        <w:rPr>
+          <w:sz w:val="18"/>
+          <w:szCs w:val="18"/>
+        </w:rPr>
+        <w:t>Used CSS Flexbox, Grid and media queries to create responsive layouts across different screen sizes.</w:t>
+      </w:r>
+    </w:p>
+    <w:p>
+      <w:pPr>
+        <w:rPr>
+          <w:sz w:val="18"/>
+          <w:szCs w:val="18"/>
+          <w:lang w:bidi="ar-SA"/>
+        </w:rPr>
+      </w:pPr>
+    </w:p>
+    <w:p>
+      <w:pPr>
+        <w:rPr>
+          <w:lang w:bidi="ar-SA"/>
+        </w:rPr>
+      </w:pPr>
+    </w:p>
+    <w:p>
+      <w:pPr>
+        <w:rPr>
+          <w:lang w:bidi="ar-SA"/>
+        </w:rPr>
+      </w:pPr>
+    </w:p>
+    <w:p>
+      <w:pPr>
+        <w:pStyle w:val="Subtitle"/>
+      </w:pPr>
+      <w:sdt>
+        <w:sdtPr>
+          <w:id w:val="-1403365644"/>
+          <w:placeholder>
+            <w:docPart w:val="3819FECED2CC9940A3CDBAD2F974B23F"/>
+          </w:placeholder>
+          <w:temporary/>
+          <w:showingPlcHdr/>
+          <w15:appearance w15:val="hidden"/>
+        </w:sdtPr>
+        <w:sdtContent>
+          <w:r>
+            <w:t>Experience</w:t>
+          </w:r>
+        </w:sdtContent>
+      </w:sdt>
+    </w:p>
+    <w:p>
+      <w:pPr>
+        <w:pStyle w:val="Heading2"/>
+        <w:ind w:left="0"/>
+        <w:rPr>
+          <w:rFonts w:eastAsia="Times New Roman" w:cs="Times New Roman"/>
+          <w:szCs w:val="36"/>
+          <w:lang w:bidi="ar-SA"/>
+        </w:rPr>
+      </w:pPr>
+    </w:p>
+    <w:p>
+      <w:pPr>
+        <w:rPr>
+          <w:b/>
+          <w:bCs/>
+          <w:sz w:val="18"/>
+          <w:szCs w:val="18"/>
+        </w:rPr>
+      </w:pPr>
+      <w:r>
+        <w:rPr>
+          <w:rStyle w:val="Strong"/>
+          <w:sz w:val="18"/>
+          <w:szCs w:val="18"/>
+        </w:rPr>
+        <w:t>Senior Team Member — Dough What</w:t>
+      </w:r>
+      <w:r>
+        <w:rPr>
+          <w:sz w:val="18"/>
+          <w:szCs w:val="18"/>
+        </w:rPr>
+        <w:br/>
+      </w:r>
+      <w:r>
+        <w:rPr>
+          <w:rStyle w:val="Emphasis"/>
+          <w:sz w:val="18"/>
+          <w:szCs w:val="18"/>
+        </w:rPr>
+        <w:t>Leicester, UK | November 2025 – Present</w:t>
+      </w:r>
+    </w:p>
+    <w:p>
+      <w:pPr>
+        <w:pStyle w:val="ListParagraph"/>
+        <w:numPr>
+          <w:ilvl w:val="0"/>
+          <w:numId w:val="11"/>
+        </w:numPr>
+        <w:rPr>
+          <w:sz w:val="18"/>
+          <w:szCs w:val="18"/>
+        </w:rPr>
+      </w:pPr>
+      <w:r>
+        <w:rPr>
+          <w:sz w:val="18"/>
+          <w:szCs w:val="18"/>
+        </w:rPr>
+        <w:t>Take responsibility for day-to-day operations during busy periods, prioritising tasks and ensuring work is completed efficiently.</w:t>
+      </w:r>
+    </w:p>
+    <w:p>
+      <w:pPr>
+        <w:pStyle w:val="ListParagraph"/>
+        <w:numPr>
+          <w:ilvl w:val="0"/>
+          <w:numId w:val="11"/>
+        </w:numPr>
+        <w:rPr>
+          <w:sz w:val="18"/>
+          <w:szCs w:val="18"/>
+        </w:rPr>
+      </w:pPr>
+      <w:r>
+        <w:rPr>
+          <w:sz w:val="18"/>
+          <w:szCs w:val="18"/>
+        </w:rPr>
+        <w:t>Support and guide team members, helping maintain a productive and organised working environment.</w:t>
+      </w:r>
+    </w:p>
+    <w:p>
+      <w:pPr>
+        <w:pStyle w:val="ListParagraph"/>
+        <w:numPr>
+          <w:ilvl w:val="0"/>
+          <w:numId w:val="11"/>
+        </w:numPr>
+        <w:rPr>
+          <w:sz w:val="18"/>
+          <w:szCs w:val="18"/>
+        </w:rPr>
+      </w:pPr>
+      <w:r>
+        <w:rPr>
+          <w:sz w:val="18"/>
+          <w:szCs w:val="18"/>
+        </w:rPr>
+        <w:t>Communicate effectively with customers and colleagues to resolve issues and maintain a high standard of service.</w:t>
+      </w:r>
+    </w:p>
+    <w:p>
+      <w:pPr>
+        <w:pStyle w:val="ListParagraph"/>
+        <w:numPr>
+          <w:ilvl w:val="0"/>
+          <w:numId w:val="11"/>
+        </w:numPr>
+        <w:rPr>
+          <w:sz w:val="18"/>
+          <w:szCs w:val="18"/>
+        </w:rPr>
+      </w:pPr>
+      <w:r>
+        <w:rPr>
+          <w:sz w:val="18"/>
+          <w:szCs w:val="18"/>
+        </w:rPr>
+        <w:t>Work effectively under pressure while managing multiple tasks within strict time constraints.</w:t>
+      </w:r>
+    </w:p>
+    <w:p>
+      <w:pPr>
+        <w:pStyle w:val="ListParagraph"/>
+        <w:numPr>
+          <w:ilvl w:val="0"/>
+          <w:numId w:val="11"/>
+        </w:numPr>
+        <w:rPr>
+          <w:sz w:val="18"/>
+          <w:szCs w:val="18"/>
+        </w:rPr>
+      </w:pPr>
+      <w:r>
+        <w:rPr>
+          <w:sz w:val="18"/>
+          <w:szCs w:val="18"/>
+        </w:rPr>
+        <w:t>Demonstrate reliability and adaptability by taking on additional responsibilities when required.</w:t>
+      </w:r>
+    </w:p>
+    <w:p>
+      <w:pPr>
+        <w:pStyle w:val="ListParagraph"/>
+        <w:numPr>
+          <w:ilvl w:val="0"/>
+          <w:numId w:val="11"/>
+        </w:numPr>
+        <w:rPr>
+          <w:sz w:val="18"/>
+          <w:szCs w:val="18"/>
+        </w:rPr>
+      </w:pPr>
+      <w:r>
+        <w:rPr>
+          <w:sz w:val="18"/>
+          <w:szCs w:val="18"/>
+        </w:rPr>
+        <w:t>Developed strong teamwork, communication, problem-solving and time-management skills in a fast-paced environment.</w:t>
+      </w:r>
+    </w:p>
+    <w:p>
+      <w:pPr>
+        <w:rPr>
+          <w:sz w:val="18"/>
+          <w:szCs w:val="18"/>
+        </w:rPr>
+      </w:pPr>
+    </w:p>
+    <w:p>
+      <w:pPr>
+        <w:rPr>
+          <w:rFonts w:eastAsia="Times New Roman" w:cs="Times New Roman"/>
+          <w:sz w:val="18"/>
+          <w:szCs w:val="18"/>
+          <w:lang w:bidi="ar-SA"/>
+        </w:rPr>
+      </w:pPr>
+      <w:r>
+        <w:rPr>
+          <w:sz w:val="18"/>
+          <w:szCs w:val="18"/>
+        </w:rPr>
+        <w:t>PEER MENTOR — UNIVERSITY OF LEICESTER</w:t>
+      </w:r>
+    </w:p>
+    <w:p>
+      <w:pPr>
+        <w:rPr>
+          <w:sz w:val="18"/>
+          <w:szCs w:val="18"/>
+        </w:rPr>
+      </w:pPr>
+      <w:r>
+        <w:rPr>
+          <w:sz w:val="18"/>
+          <w:szCs w:val="18"/>
+        </w:rPr>
+        <w:t>2026–Present | Leicester, UK</w:t>
+      </w:r>
+    </w:p>
+    <w:p>
+      <w:pPr>
+        <w:pStyle w:val="ListParagraph"/>
+        <w:numPr>
+          <w:ilvl w:val="0"/>
+          <w:numId w:val="12"/>
+        </w:numPr>
+        <w:rPr>
+          <w:sz w:val="18"/>
+          <w:szCs w:val="18"/>
+        </w:rPr>
+      </w:pPr>
+      <w:r>
+        <w:rPr>
+          <w:sz w:val="18"/>
+          <w:szCs w:val="18"/>
+        </w:rPr>
+        <w:t>Selected and trained as a Peer Mentor to support new students as they transition into university life.</w:t>
+      </w:r>
+    </w:p>
+    <w:p>
+      <w:pPr>
+        <w:pStyle w:val="ListParagraph"/>
+        <w:numPr>
+          <w:ilvl w:val="0"/>
+          <w:numId w:val="12"/>
+        </w:numPr>
+        <w:rPr>
+          <w:sz w:val="18"/>
+          <w:szCs w:val="18"/>
+        </w:rPr>
+      </w:pPr>
+      <w:r>
+        <w:rPr>
+          <w:sz w:val="18"/>
+          <w:szCs w:val="18"/>
+        </w:rPr>
+        <w:t>Will provide regular one-to-one support, checking in with mentees approximately every two weeks throughout the academic year.</w:t>
+      </w:r>
+    </w:p>
+    <w:p>
+      <w:pPr>
+        <w:pStyle w:val="ListParagraph"/>
+        <w:numPr>
+          <w:ilvl w:val="0"/>
+          <w:numId w:val="12"/>
+        </w:numPr>
+        <w:rPr>
+          <w:sz w:val="18"/>
+          <w:szCs w:val="18"/>
+        </w:rPr>
+      </w:pPr>
+      <w:r>
+        <w:rPr>
+          <w:sz w:val="18"/>
+          <w:szCs w:val="18"/>
+        </w:rPr>
+        <w:t>Help students settle into university, access available support and feel comfortable within the university community.</w:t>
+      </w:r>
+    </w:p>
+    <w:p>
+      <w:pPr>
+        <w:pStyle w:val="ListParagraph"/>
+        <w:numPr>
+          <w:ilvl w:val="0"/>
+          <w:numId w:val="12"/>
+        </w:numPr>
+        <w:rPr>
+          <w:sz w:val="18"/>
+          <w:szCs w:val="18"/>
+        </w:rPr>
+      </w:pPr>
+      <w:r>
+        <w:rPr>
+          <w:sz w:val="18"/>
+          <w:szCs w:val="18"/>
+        </w:rPr>
+        <w:t>Developed communication, active listening and interpersonal skills through mentor training and preparation.</w:t>
+      </w:r>
+    </w:p>
+    <w:p/>
+    <w:p/>
+    <w:p>
+      <w:pPr>
+        <w:pStyle w:val="Subtitle"/>
+        <w:sectPr>
+          <w:pgSz w:w="12240" w:h="15840"/>
+          <w:pgMar w:top="634" w:right="1440" w:bottom="634" w:left="1440" w:header="720" w:footer="0" w:gutter="0"/>
+          <w:cols w:space="720"/>
+          <w:docGrid w:linePitch="272"/>
+        </w:sectPr>
       </w:pPr>
       <w:r>
         <w:rPr>
@@ -20,18 +793,18 @@
         <mc:AlternateContent>
           <mc:Choice Requires="wpg">
             <w:drawing>
-              <wp:anchor distT="0" distB="0" distL="114300" distR="114300" simplePos="0" relativeHeight="251659264" behindDoc="1" locked="1" layoutInCell="1" allowOverlap="1" wp14:anchorId="1D25FC72" wp14:editId="7AA8F1F3">
+              <wp:anchor distT="0" distB="0" distL="114300" distR="114300" simplePos="0" relativeHeight="251661312" behindDoc="1" locked="1" layoutInCell="1" allowOverlap="1" wp14:anchorId="38F8B7D0" wp14:editId="2469B191">
                 <wp:simplePos x="0" y="0"/>
                 <wp:positionH relativeFrom="margin">
-                  <wp:posOffset>-519545</wp:posOffset>
+                  <wp:posOffset>-523240</wp:posOffset>
                 </wp:positionH>
                 <wp:positionV relativeFrom="margin">
-                  <wp:posOffset>-402590</wp:posOffset>
+                  <wp:posOffset>9744075</wp:posOffset>
                 </wp:positionV>
                 <wp:extent cx="6985635" cy="10058400"/>
                 <wp:effectExtent l="0" t="0" r="5715" b="0"/>
                 <wp:wrapNone/>
-                <wp:docPr id="1" name="Group 1">
+                <wp:docPr id="1896857978" name="Group 1896857978">
                   <a:extLst xmlns:a="http://schemas.openxmlformats.org/drawingml/2006/main">
                     <a:ext uri="{C183D7F6-B498-43B3-948B-1728B52AA6E4}">
                       <adec:decorative xmlns:adec="http://schemas.microsoft.com/office/drawing/2017/decorative" val="1"/>
@@ -56,13 +829,7 @@
                         </a:xfrm>
                       </wpg:grpSpPr>
                       <wps:wsp>
-                        <wps:cNvPr id="7" name="Freeform 6">
-                          <a:extLst>
-                            <a:ext uri="{FF2B5EF4-FFF2-40B4-BE49-F238E27FC236}">
-                              <a16:creationId xmlns:a16="http://schemas.microsoft.com/office/drawing/2014/main" id="{97861BD5-9E4C-D546-A13E-D5CF77915A18}"/>
-                            </a:ext>
-                          </a:extLst>
-                        </wps:cNvPr>
+                        <wps:cNvPr id="876678444" name="Freeform 6"/>
                         <wps:cNvSpPr/>
                         <wps:spPr>
                           <a:xfrm>
@@ -132,13 +899,7 @@
                         </wps:bodyPr>
                       </wps:wsp>
                       <wps:wsp>
-                        <wps:cNvPr id="9" name="Freeform 8">
-                          <a:extLst>
-                            <a:ext uri="{FF2B5EF4-FFF2-40B4-BE49-F238E27FC236}">
-                              <a16:creationId xmlns:a16="http://schemas.microsoft.com/office/drawing/2014/main" id="{34C66C4E-700E-194D-BC81-934C3C3CDCA8}"/>
-                            </a:ext>
-                          </a:extLst>
-                        </wps:cNvPr>
+                        <wps:cNvPr id="1729360840" name="Freeform 8"/>
                         <wps:cNvSpPr/>
                         <wps:spPr>
                           <a:xfrm>
@@ -208,13 +969,7 @@
                         </wps:bodyPr>
                       </wps:wsp>
                       <wps:wsp>
-                        <wps:cNvPr id="10" name="Freeform 9">
-                          <a:extLst>
-                            <a:ext uri="{FF2B5EF4-FFF2-40B4-BE49-F238E27FC236}">
-                              <a16:creationId xmlns:a16="http://schemas.microsoft.com/office/drawing/2014/main" id="{2AA49747-F257-AA44-98C1-DE57A0977D0A}"/>
-                            </a:ext>
-                          </a:extLst>
-                        </wps:cNvPr>
+                        <wps:cNvPr id="2020390574" name="Freeform 9"/>
                         <wps:cNvSpPr/>
                         <wps:spPr>
                           <a:xfrm>
@@ -284,13 +1039,7 @@
                         </wps:bodyPr>
                       </wps:wsp>
                       <wps:wsp>
-                        <wps:cNvPr id="12" name="Freeform 11">
-                          <a:extLst>
-                            <a:ext uri="{FF2B5EF4-FFF2-40B4-BE49-F238E27FC236}">
-                              <a16:creationId xmlns:a16="http://schemas.microsoft.com/office/drawing/2014/main" id="{D70623B7-9CCF-624C-B2B4-A46F42F5CE0C}"/>
-                            </a:ext>
-                          </a:extLst>
-                        </wps:cNvPr>
+                        <wps:cNvPr id="1505257399" name="Freeform 11"/>
                         <wps:cNvSpPr/>
                         <wps:spPr>
                           <a:xfrm>
@@ -373,21 +1122,21 @@
           </mc:Choice>
           <mc:Fallback>
             <w:pict>
-              <v:group w14:anchorId="2CC5D8A5" id="Group 1" o:spid="_x0000_s1026" alt="&quot;&quot;" style="position:absolute;margin-left:-40.9pt;margin-top:-31.7pt;width:550.05pt;height:11in;z-index:-251657216;mso-position-horizontal-relative:margin;mso-position-vertical-relative:margin;mso-width-relative:margin;mso-height-relative:margin" coordsize="47625,68580" o:gfxdata="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">
+              <v:group w14:anchorId="37458784" id="Group 1896857978" o:spid="_x0000_s1026" alt="&quot;&quot;" style="position:absolute;margin-left:-41.2pt;margin-top:767.25pt;width:550.05pt;height:11in;z-index:-251655168;mso-position-horizontal-relative:margin;mso-position-vertical-relative:margin;mso-width-relative:margin;mso-height-relative:margin" coordsize="47625,68580" o:gfxdata="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">
                 <o:lock v:ext="edit" aspectratio="t"/>
-                <v:shape id="Freeform 6" o:spid="_x0000_s1027" style="position:absolute;width:62;height:68580;visibility:visible;mso-wrap-style:square;v-text-anchor:middle" coordsize="6234,6858000" o:gfxdata="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" path="m,l6235,r,6858000l,6858000,,xe" fillcolor="#669748" stroked="f" strokeweight=".24036mm">
+                <v:shape id="Freeform 6" o:spid="_x0000_s1027" style="position:absolute;width:62;height:68580;visibility:visible;mso-wrap-style:square;v-text-anchor:middle" coordsize="6234,6858000" o:gfxdata="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" path="m,l6235,r,6858000l,6858000,,xe" fillcolor="#669748" stroked="f" strokeweight=".24036mm">
                   <v:stroke joinstyle="miter"/>
                   <v:path arrowok="t" o:connecttype="custom" o:connectlocs="0,0;6235,0;6235,6858000;0,6858000" o:connectangles="0,0,0,0"/>
                 </v:shape>
-                <v:shape id="Freeform 8" o:spid="_x0000_s1028" style="position:absolute;left:283;width:125;height:68580;visibility:visible;mso-wrap-style:square;v-text-anchor:middle" coordsize="12469,6858000" o:gfxdata="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" path="m,l12469,r,6858000l,6858000,,xe" fillcolor="#669748" stroked="f" strokeweight=".24036mm">
+                <v:shape id="Freeform 8" o:spid="_x0000_s1028" style="position:absolute;left:283;width:125;height:68580;visibility:visible;mso-wrap-style:square;v-text-anchor:middle" coordsize="12469,6858000" o:gfxdata="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" path="m,l12469,r,6858000l,6858000,,xe" fillcolor="#669748" stroked="f" strokeweight=".24036mm">
                   <v:stroke joinstyle="miter"/>
                   <v:path arrowok="t" o:connecttype="custom" o:connectlocs="0,0;12469,0;12469,6858000;0,6858000" o:connectangles="0,0,0,0"/>
                 </v:shape>
-                <v:shape id="Freeform 9" o:spid="_x0000_s1029" style="position:absolute;left:47562;width:63;height:68580;visibility:visible;mso-wrap-style:square;v-text-anchor:middle" coordsize="6234,6858000" o:gfxdata="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" path="m,l6234,r,6858000l,6858000,,xe" fillcolor="#669748" stroked="f" strokeweight=".24036mm">
+                <v:shape id="Freeform 9" o:spid="_x0000_s1029" style="position:absolute;left:47562;width:63;height:68580;visibility:visible;mso-wrap-style:square;v-text-anchor:middle" coordsize="6234,6858000" o:gfxdata="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" path="m,l6234,r,6858000l,6858000,,xe" fillcolor="#669748" stroked="f" strokeweight=".24036mm">
                   <v:stroke joinstyle="miter"/>
                   <v:path arrowok="t" o:connecttype="custom" o:connectlocs="0,0;6234,0;6234,6858000;0,6858000" o:connectangles="0,0,0,0"/>
                 </v:shape>
-                <v:shape id="Freeform 11" o:spid="_x0000_s1030" style="position:absolute;left:47208;width:125;height:68580;visibility:visible;mso-wrap-style:square;v-text-anchor:middle" coordsize="12469,6858000" o:gfxdata="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" path="m,l12469,r,6858000l,6858000,,xe" fillcolor="#669748" stroked="f" strokeweight=".24036mm">
+                <v:shape id="Freeform 11" o:spid="_x0000_s1030" style="position:absolute;left:47208;width:125;height:68580;visibility:visible;mso-wrap-style:square;v-text-anchor:middle" coordsize="12469,6858000" o:gfxdata="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" path="m,l12469,r,6858000l,6858000,,xe" fillcolor="#669748" stroked="f" strokeweight=".24036mm">
                   <v:stroke joinstyle="miter"/>
                   <v:path arrowok="t" o:connecttype="custom" o:connectlocs="0,0;12469,0;12469,6858000;0,6858000" o:connectangles="0,0,0,0"/>
                 </v:shape>
@@ -398,718 +1147,6 @@
           </mc:Fallback>
         </mc:AlternateContent>
       </w:r>
-    </w:p>
-    <w:p>
-      <w:pPr>
-        <w:pStyle w:val="Title"/>
-      </w:pPr>
-      <w:r>
-        <w:t>Veer Rana</w:t>
-      </w:r>
-    </w:p>
-    <w:p>
-      <w:proofErr w:type="spellStart"/>
-      <w:proofErr w:type="gramStart"/>
-      <w:r>
-        <w:t>Leicester,UK</w:t>
-      </w:r>
-      <w:proofErr w:type="spellEnd"/>
-      <w:proofErr w:type="gramEnd"/>
-      <w:r>
-        <w:t xml:space="preserve">|+44 </w:t>
-      </w:r>
-      <w:hyperlink r:id="rId11" w:history="1">
-        <w:r>
-          <w:rPr>
-            <w:rStyle w:val="Hyperlink"/>
-          </w:rPr>
-          <w:t>7417361262|ranaveer2525@gmail.com</w:t>
-        </w:r>
-      </w:hyperlink>
-    </w:p>
-    <w:p>
-      <w:r>
-        <w:t>LinkedIn | GitHub | Portfolio</w:t>
-      </w:r>
-    </w:p>
-    <w:p>
-      <w:pPr>
-        <w:pStyle w:val="Subtitle"/>
-      </w:pPr>
-    </w:p>
-    <w:p>
-      <w:pPr>
-        <w:pStyle w:val="Subtitle"/>
-      </w:pPr>
-    </w:p>
-    <w:p>
-      <w:pPr>
-        <w:pStyle w:val="Subtitle"/>
-      </w:pPr>
-      <w:r>
-        <w:t xml:space="preserve">About me </w:t>
-      </w:r>
-    </w:p>
-    <w:p>
-      <w:pPr>
-        <w:rPr>
-          <w:lang w:bidi="ar-SA"/>
-        </w:rPr>
-      </w:pPr>
-    </w:p>
-    <w:p>
-      <w:pPr>
-        <w:rPr>
-          <w:sz w:val="18"/>
-          <w:szCs w:val="18"/>
-        </w:rPr>
-      </w:pPr>
-      <w:r>
-        <w:rPr>
-          <w:sz w:val="18"/>
-          <w:szCs w:val="18"/>
-        </w:rPr>
-        <w:t>Computer Science student at the University of Leicester with experience developing full-stack applications using Python, C#, SQL, HTML, CSS and JavaScript. Interested in software engineering and full-stack development, with practical experience building web applications and database-driven projects. Seeking a 2027 software engineering placement to apply and develop my technical skills in a professional environment.</w:t>
-      </w:r>
-    </w:p>
-    <w:p/>
-    <w:p>
-      <w:pPr>
-        <w:pStyle w:val="Subtitle"/>
-      </w:pPr>
-      <w:r>
-        <w:t>Projects</w:t>
-      </w:r>
-    </w:p>
-    <w:p>
-      <w:pPr>
-        <w:rPr>
-          <w:lang w:bidi="ar-SA"/>
-        </w:rPr>
-      </w:pPr>
-    </w:p>
-    <w:p>
-      <w:pPr>
-        <w:pStyle w:val="Heading2"/>
-      </w:pPr>
-      <w:r>
-        <w:t>Cricket Game &amp; Player Management System</w:t>
-      </w:r>
-    </w:p>
-    <w:p>
-      <w:pPr>
-        <w:rPr>
-          <w:sz w:val="18"/>
-          <w:szCs w:val="18"/>
-        </w:rPr>
-      </w:pPr>
-      <w:r>
-        <w:rPr>
-          <w:rStyle w:val="Strong"/>
-          <w:sz w:val="18"/>
-          <w:szCs w:val="18"/>
-        </w:rPr>
-        <w:t>C# | Unity | SQLite | SQL</w:t>
-      </w:r>
-    </w:p>
-    <w:p>
-      <w:pPr>
-        <w:pStyle w:val="ListParagraph"/>
-        <w:numPr>
-          <w:ilvl w:val="0"/>
-          <w:numId w:val="26"/>
-        </w:numPr>
-        <w:rPr>
-          <w:sz w:val="18"/>
-          <w:szCs w:val="18"/>
-        </w:rPr>
-      </w:pPr>
-      <w:r>
-        <w:rPr>
-          <w:sz w:val="18"/>
-          <w:szCs w:val="18"/>
-        </w:rPr>
-        <w:t>Developed an interactive 3D cricket game in Unity using C#, implementing gameplay mechanics including ball physics and scoring.</w:t>
-      </w:r>
-    </w:p>
-    <w:p>
-      <w:pPr>
-        <w:pStyle w:val="ListParagraph"/>
-        <w:numPr>
-          <w:ilvl w:val="0"/>
-          <w:numId w:val="26"/>
-        </w:numPr>
-        <w:rPr>
-          <w:sz w:val="18"/>
-          <w:szCs w:val="18"/>
-        </w:rPr>
-      </w:pPr>
-      <w:r>
-        <w:rPr>
-          <w:sz w:val="18"/>
-          <w:szCs w:val="18"/>
-        </w:rPr>
-        <w:t>Built a SQLite-backed player management system supporting user registration/login, persistent scores, match history and a Top 10 leaderboard using SQL queries.</w:t>
-      </w:r>
-    </w:p>
-    <w:p>
-      <w:pPr>
-        <w:pStyle w:val="ListParagraph"/>
-        <w:numPr>
-          <w:ilvl w:val="0"/>
-          <w:numId w:val="26"/>
-        </w:numPr>
-        <w:rPr>
-          <w:sz w:val="18"/>
-          <w:szCs w:val="18"/>
-        </w:rPr>
-      </w:pPr>
-      <w:r>
-        <w:rPr>
-          <w:sz w:val="18"/>
-          <w:szCs w:val="18"/>
-        </w:rPr>
-        <w:t>Implemented session management and a points system to associate gameplay data with individual users and persist player rewards.</w:t>
-      </w:r>
-    </w:p>
-    <w:p>
-      <w:pPr>
-        <w:pStyle w:val="Heading2"/>
-      </w:pPr>
-      <w:proofErr w:type="spellStart"/>
-      <w:r>
-        <w:t>SortStudents</w:t>
-      </w:r>
-      <w:proofErr w:type="spellEnd"/>
-      <w:r>
-        <w:t xml:space="preserve"> — Collaborative Student Household Task Manager</w:t>
-      </w:r>
-    </w:p>
-    <w:p>
-      <w:pPr>
-        <w:rPr>
-          <w:sz w:val="18"/>
-          <w:szCs w:val="18"/>
-        </w:rPr>
-      </w:pPr>
-      <w:r>
-        <w:rPr>
-          <w:rStyle w:val="Strong"/>
-          <w:sz w:val="18"/>
-          <w:szCs w:val="18"/>
-        </w:rPr>
-        <w:t>Python | Django | SQLite | HTML/CSS | JavaScript | Bootstrap | HTMX</w:t>
-      </w:r>
-    </w:p>
-    <w:p>
-      <w:pPr>
-        <w:pStyle w:val="ListParagraph"/>
-        <w:numPr>
-          <w:ilvl w:val="0"/>
-          <w:numId w:val="27"/>
-        </w:numPr>
-        <w:rPr>
-          <w:sz w:val="18"/>
-          <w:szCs w:val="18"/>
-        </w:rPr>
-      </w:pPr>
-      <w:r>
-        <w:rPr>
-          <w:sz w:val="18"/>
-          <w:szCs w:val="18"/>
-        </w:rPr>
-        <w:t>Collaborated as one of five developers to build a Django web application helping students in shared accommodation organise and assign household tasks.</w:t>
-      </w:r>
-    </w:p>
-    <w:p>
-      <w:pPr>
-        <w:pStyle w:val="ListParagraph"/>
-        <w:numPr>
-          <w:ilvl w:val="0"/>
-          <w:numId w:val="27"/>
-        </w:numPr>
-        <w:rPr>
-          <w:sz w:val="18"/>
-          <w:szCs w:val="18"/>
-        </w:rPr>
-      </w:pPr>
-      <w:r>
-        <w:rPr>
-          <w:sz w:val="18"/>
-          <w:szCs w:val="18"/>
-        </w:rPr>
-        <w:t>Developed database-backed functionality for households, student profiles, task assignment, due dates and completion tracking using Django and SQLite.</w:t>
-      </w:r>
-    </w:p>
-    <w:p>
-      <w:pPr>
-        <w:pStyle w:val="ListParagraph"/>
-        <w:numPr>
-          <w:ilvl w:val="0"/>
-          <w:numId w:val="27"/>
-        </w:numPr>
-        <w:rPr>
-          <w:sz w:val="18"/>
-          <w:szCs w:val="18"/>
-        </w:rPr>
-      </w:pPr>
-      <w:r>
-        <w:rPr>
-          <w:sz w:val="18"/>
-          <w:szCs w:val="18"/>
-        </w:rPr>
-        <w:t>Implemented session-based authentication and personalised task views based on the logged-in student and household.</w:t>
-      </w:r>
-    </w:p>
-    <w:p>
-      <w:pPr>
-        <w:pStyle w:val="ListParagraph"/>
-        <w:numPr>
-          <w:ilvl w:val="0"/>
-          <w:numId w:val="27"/>
-        </w:numPr>
-        <w:rPr>
-          <w:sz w:val="18"/>
-          <w:szCs w:val="18"/>
-        </w:rPr>
-      </w:pPr>
-      <w:r>
-        <w:rPr>
-          <w:sz w:val="18"/>
-          <w:szCs w:val="18"/>
-        </w:rPr>
-        <w:t>Used HTMX to asynchronously update task completion status without requiring a full page reload.</w:t>
-      </w:r>
-    </w:p>
-    <w:p>
-      <w:pPr>
-        <w:pStyle w:val="Heading2"/>
-      </w:pPr>
-      <w:proofErr w:type="spellStart"/>
-      <w:r>
-        <w:t>MusicFest</w:t>
-      </w:r>
-      <w:proofErr w:type="spellEnd"/>
-      <w:r>
-        <w:t xml:space="preserve"> 2025 — University Web Development Project</w:t>
-      </w:r>
-    </w:p>
-    <w:p>
-      <w:pPr>
-        <w:rPr>
-          <w:sz w:val="18"/>
-          <w:szCs w:val="18"/>
-        </w:rPr>
-      </w:pPr>
-      <w:r>
-        <w:rPr>
-          <w:rStyle w:val="Strong"/>
-          <w:sz w:val="18"/>
-          <w:szCs w:val="18"/>
-        </w:rPr>
-        <w:t>HTML | CSS | JavaScript</w:t>
-      </w:r>
-    </w:p>
-    <w:p>
-      <w:pPr>
-        <w:pStyle w:val="ListParagraph"/>
-        <w:numPr>
-          <w:ilvl w:val="0"/>
-          <w:numId w:val="28"/>
-        </w:numPr>
-        <w:rPr>
-          <w:sz w:val="18"/>
-          <w:szCs w:val="18"/>
-        </w:rPr>
-      </w:pPr>
-      <w:r>
-        <w:rPr>
-          <w:sz w:val="18"/>
-          <w:szCs w:val="18"/>
-        </w:rPr>
-        <w:t>Designed and developed a responsive multi-page music festival website featuring event information, artist line-up, schedules and ticket booking.</w:t>
-      </w:r>
-    </w:p>
-    <w:p>
-      <w:pPr>
-        <w:pStyle w:val="ListParagraph"/>
-        <w:numPr>
-          <w:ilvl w:val="0"/>
-          <w:numId w:val="28"/>
-        </w:numPr>
-        <w:rPr>
-          <w:sz w:val="18"/>
-          <w:szCs w:val="18"/>
-        </w:rPr>
-      </w:pPr>
-      <w:r>
-        <w:rPr>
-          <w:sz w:val="18"/>
-          <w:szCs w:val="18"/>
-        </w:rPr>
-        <w:t>Implemented JavaScript functionality including schedule filtering, dark/light mode persistence and client-side form validation.</w:t>
-      </w:r>
-    </w:p>
-    <w:p>
-      <w:pPr>
-        <w:pStyle w:val="ListParagraph"/>
-        <w:numPr>
-          <w:ilvl w:val="0"/>
-          <w:numId w:val="28"/>
-        </w:numPr>
-        <w:rPr>
-          <w:sz w:val="18"/>
-          <w:szCs w:val="18"/>
-        </w:rPr>
-      </w:pPr>
-      <w:r>
-        <w:rPr>
-          <w:sz w:val="18"/>
-          <w:szCs w:val="18"/>
-        </w:rPr>
-        <w:t>Used CSS Flexbox, Grid and media queries to create responsive layouts across different screen sizes.</w:t>
-      </w:r>
-    </w:p>
-    <w:p>
-      <w:pPr>
-        <w:rPr>
-          <w:sz w:val="18"/>
-          <w:szCs w:val="18"/>
-          <w:lang w:bidi="ar-SA"/>
-        </w:rPr>
-      </w:pPr>
-    </w:p>
-    <w:p>
-      <w:pPr>
-        <w:rPr>
-          <w:lang w:bidi="ar-SA"/>
-        </w:rPr>
-      </w:pPr>
-    </w:p>
-    <w:p>
-      <w:pPr>
-        <w:rPr>
-          <w:lang w:bidi="ar-SA"/>
-        </w:rPr>
-      </w:pPr>
-    </w:p>
-    <w:p>
-      <w:pPr>
-        <w:pStyle w:val="Subtitle"/>
-      </w:pPr>
-      <w:sdt>
-        <w:sdtPr>
-          <w:id w:val="-1403365644"/>
-          <w:placeholder>
-            <w:docPart w:val="3819FECED2CC9940A3CDBAD2F974B23F"/>
-          </w:placeholder>
-          <w:temporary/>
-          <w:showingPlcHdr/>
-          <w15:appearance w15:val="hidden"/>
-        </w:sdtPr>
-        <w:sdtContent>
-          <w:r>
-            <w:t>Experience</w:t>
-          </w:r>
-        </w:sdtContent>
-      </w:sdt>
-    </w:p>
-    <w:p>
-      <w:pPr>
-        <w:pStyle w:val="Heading2"/>
-        <w:ind w:left="0"/>
-        <w:rPr>
-          <w:rFonts w:eastAsia="Times New Roman" w:cs="Times New Roman"/>
-          <w:szCs w:val="36"/>
-          <w:lang w:bidi="ar-SA"/>
-        </w:rPr>
-      </w:pPr>
-    </w:p>
-    <w:p>
-      <w:pPr>
-        <w:rPr>
-          <w:b/>
-          <w:bCs/>
-          <w:sz w:val="18"/>
-          <w:szCs w:val="18"/>
-        </w:rPr>
-      </w:pPr>
-      <w:r>
-        <w:rPr>
-          <w:rStyle w:val="Strong"/>
-          <w:sz w:val="18"/>
-          <w:szCs w:val="18"/>
-        </w:rPr>
-        <w:t>Senior Team Member — Dough What</w:t>
-      </w:r>
-      <w:r>
-        <w:rPr>
-          <w:sz w:val="18"/>
-          <w:szCs w:val="18"/>
-        </w:rPr>
-        <w:br/>
-      </w:r>
-      <w:r>
-        <w:rPr>
-          <w:rStyle w:val="Emphasis"/>
-          <w:sz w:val="18"/>
-          <w:szCs w:val="18"/>
-        </w:rPr>
-        <w:t>Leicester, UK | November 2025 – Present</w:t>
-      </w:r>
-    </w:p>
-    <w:p>
-      <w:pPr>
-        <w:pStyle w:val="ListParagraph"/>
-        <w:numPr>
-          <w:ilvl w:val="0"/>
-          <w:numId w:val="11"/>
-        </w:numPr>
-        <w:rPr>
-          <w:sz w:val="18"/>
-          <w:szCs w:val="18"/>
-        </w:rPr>
-      </w:pPr>
-      <w:r>
-        <w:rPr>
-          <w:sz w:val="18"/>
-          <w:szCs w:val="18"/>
-        </w:rPr>
-        <w:t>Take responsibility for day-to-day operations during busy periods, prioritising tasks and ensuring work is completed efficiently.</w:t>
-      </w:r>
-    </w:p>
-    <w:p>
-      <w:pPr>
-        <w:pStyle w:val="ListParagraph"/>
-        <w:numPr>
-          <w:ilvl w:val="0"/>
-          <w:numId w:val="11"/>
-        </w:numPr>
-        <w:rPr>
-          <w:sz w:val="18"/>
-          <w:szCs w:val="18"/>
-        </w:rPr>
-      </w:pPr>
-      <w:r>
-        <w:rPr>
-          <w:sz w:val="18"/>
-          <w:szCs w:val="18"/>
-        </w:rPr>
-        <w:t>Support and guide team members, helping maintain a productive and organised working environment.</w:t>
-      </w:r>
-    </w:p>
-    <w:p>
-      <w:pPr>
-        <w:pStyle w:val="ListParagraph"/>
-        <w:numPr>
-          <w:ilvl w:val="0"/>
-          <w:numId w:val="11"/>
-        </w:numPr>
-        <w:rPr>
-          <w:sz w:val="18"/>
-          <w:szCs w:val="18"/>
-        </w:rPr>
-      </w:pPr>
-      <w:r>
-        <w:rPr>
-          <w:sz w:val="18"/>
-          <w:szCs w:val="18"/>
-        </w:rPr>
-        <w:t>Communicate effectively with customers and colleagues to resolve issues and maintain a high standard of service.</w:t>
-      </w:r>
-    </w:p>
-    <w:p>
-      <w:pPr>
-        <w:pStyle w:val="ListParagraph"/>
-        <w:numPr>
-          <w:ilvl w:val="0"/>
-          <w:numId w:val="11"/>
-        </w:numPr>
-        <w:rPr>
-          <w:sz w:val="18"/>
-          <w:szCs w:val="18"/>
-        </w:rPr>
-      </w:pPr>
-      <w:r>
-        <w:rPr>
-          <w:sz w:val="18"/>
-          <w:szCs w:val="18"/>
-        </w:rPr>
-        <w:t>Work effectively under pressure while managing multiple tasks within strict time constraints.</w:t>
-      </w:r>
-    </w:p>
-    <w:p>
-      <w:pPr>
-        <w:pStyle w:val="ListParagraph"/>
-        <w:numPr>
-          <w:ilvl w:val="0"/>
-          <w:numId w:val="11"/>
-        </w:numPr>
-        <w:rPr>
-          <w:sz w:val="18"/>
-          <w:szCs w:val="18"/>
-        </w:rPr>
-      </w:pPr>
-      <w:r>
-        <w:rPr>
-          <w:sz w:val="18"/>
-          <w:szCs w:val="18"/>
-        </w:rPr>
-        <w:t>Demonstrate reliability and adaptability by taking on additional responsibilities when required.</w:t>
-      </w:r>
-    </w:p>
-    <w:p>
-      <w:pPr>
-        <w:pStyle w:val="ListParagraph"/>
-        <w:numPr>
-          <w:ilvl w:val="0"/>
-          <w:numId w:val="11"/>
-        </w:numPr>
-        <w:rPr>
-          <w:sz w:val="18"/>
-          <w:szCs w:val="18"/>
-        </w:rPr>
-      </w:pPr>
-      <w:r>
-        <w:rPr>
-          <w:sz w:val="18"/>
-          <w:szCs w:val="18"/>
-        </w:rPr>
-        <w:t>Developed strong teamwork, communication, problem-solving and time-management skills in a fast-paced environment.</w:t>
-      </w:r>
-    </w:p>
-    <w:p>
-      <w:pPr>
-        <w:rPr>
-          <w:sz w:val="18"/>
-          <w:szCs w:val="18"/>
-        </w:rPr>
-      </w:pPr>
-    </w:p>
-    <w:p>
-      <w:pPr>
-        <w:rPr>
-          <w:rFonts w:eastAsia="Times New Roman" w:cs="Times New Roman"/>
-          <w:sz w:val="18"/>
-          <w:szCs w:val="18"/>
-          <w:lang w:bidi="ar-SA"/>
-        </w:rPr>
-      </w:pPr>
-      <w:r>
-        <w:rPr>
-          <w:sz w:val="18"/>
-          <w:szCs w:val="18"/>
-        </w:rPr>
-        <w:t>PEER MENTOR — UNIVERSITY OF LEICESTER</w:t>
-      </w:r>
-    </w:p>
-    <w:p>
-      <w:pPr>
-        <w:rPr>
-          <w:sz w:val="18"/>
-          <w:szCs w:val="18"/>
-        </w:rPr>
-      </w:pPr>
-      <w:r>
-        <w:rPr>
-          <w:sz w:val="18"/>
-          <w:szCs w:val="18"/>
-        </w:rPr>
-        <w:t>2026–Present | Leicester, UK</w:t>
-      </w:r>
-    </w:p>
-    <w:p>
-      <w:pPr>
-        <w:pStyle w:val="ListParagraph"/>
-        <w:numPr>
-          <w:ilvl w:val="0"/>
-          <w:numId w:val="12"/>
-        </w:numPr>
-        <w:rPr>
-          <w:sz w:val="18"/>
-          <w:szCs w:val="18"/>
-        </w:rPr>
-      </w:pPr>
-      <w:r>
-        <w:rPr>
-          <w:sz w:val="18"/>
-          <w:szCs w:val="18"/>
-        </w:rPr>
-        <w:t>Selected and trained as a Peer Mentor to support new students as they transition into university life.</w:t>
-      </w:r>
-    </w:p>
-    <w:p>
-      <w:pPr>
-        <w:pStyle w:val="ListParagraph"/>
-        <w:numPr>
-          <w:ilvl w:val="0"/>
-          <w:numId w:val="12"/>
-        </w:numPr>
-        <w:rPr>
-          <w:sz w:val="18"/>
-          <w:szCs w:val="18"/>
-        </w:rPr>
-      </w:pPr>
-      <w:r>
-        <w:rPr>
-          <w:sz w:val="18"/>
-          <w:szCs w:val="18"/>
-        </w:rPr>
-        <w:t>Will provide regular one-to-one support, checking in with mentees approximately every two weeks throughout the academic year.</w:t>
-      </w:r>
-    </w:p>
-    <w:p>
-      <w:pPr>
-        <w:pStyle w:val="ListParagraph"/>
-        <w:numPr>
-          <w:ilvl w:val="0"/>
-          <w:numId w:val="12"/>
-        </w:numPr>
-        <w:rPr>
-          <w:sz w:val="18"/>
-          <w:szCs w:val="18"/>
-        </w:rPr>
-      </w:pPr>
-      <w:r>
-        <w:rPr>
-          <w:sz w:val="18"/>
-          <w:szCs w:val="18"/>
-        </w:rPr>
-        <w:t>Help students settle into university, access available support and feel comfortable within the university community.</w:t>
-      </w:r>
-    </w:p>
-    <w:p>
-      <w:pPr>
-        <w:pStyle w:val="ListParagraph"/>
-        <w:numPr>
-          <w:ilvl w:val="0"/>
-          <w:numId w:val="12"/>
-        </w:numPr>
-        <w:rPr>
-          <w:sz w:val="18"/>
-          <w:szCs w:val="18"/>
-        </w:rPr>
-      </w:pPr>
-      <w:r>
-        <w:rPr>
-          <w:sz w:val="18"/>
-          <w:szCs w:val="18"/>
-        </w:rPr>
-        <w:t>Developed communication, active listening and interpersonal skills through mentor training and preparation.</w:t>
-      </w:r>
-    </w:p>
-    <w:p/>
-    <w:p/>
-    <w:p>
-      <w:pPr>
-        <w:pStyle w:val="Subtitle"/>
-        <w:sectPr>
-          <w:pgSz w:w="12240" w:h="15840"/>
-          <w:pgMar w:top="634" w:right="1440" w:bottom="634" w:left="1440" w:header="720" w:footer="0" w:gutter="0"/>
-          <w:cols w:space="720"/>
-          <w:docGrid w:linePitch="272"/>
-        </w:sectPr>
-      </w:pPr>
     </w:p>
     <w:p>
       <w:pPr>
@@ -6308,8 +6345,10 @@
     <w:rsid w:val="008D1059"/>
     <w:rsid w:val="008F2148"/>
     <w:rsid w:val="009C5999"/>
+    <w:rsid w:val="00C711D3"/>
     <w:rsid w:val="00DA1E3A"/>
     <w:rsid w:val="00E00EAD"/>
+    <w:rsid w:val="00EE0E09"/>
   </w:rsids>
   <m:mathPr>
     <m:mathFont m:val="Cambria Math"/>
@@ -6981,26 +7020,19 @@
 </file>
 
 <file path=customXml/item1.xml><?xml version="1.0" encoding="utf-8"?>
-<p:properties xmlns:p="http://schemas.microsoft.com/office/2006/metadata/properties" xmlns:xsi="http://www.w3.org/2001/XMLSchema-instance" xmlns:pc="http://schemas.microsoft.com/office/infopath/2007/PartnerControls">
-  <documentManagement>
-    <Background xmlns="71af3243-3dd4-4a8d-8c0d-dd76da1f02a5">false</Background>
-    <Status xmlns="71af3243-3dd4-4a8d-8c0d-dd76da1f02a5">Not started</Status>
-    <_ip_UnifiedCompliancePolicyUIAction xmlns="http://schemas.microsoft.com/sharepoint/v3" xsi:nil="true"/>
-    <Image xmlns="71af3243-3dd4-4a8d-8c0d-dd76da1f02a5">
-      <Url xsi:nil="true"/>
-      <Description xsi:nil="true"/>
-    </Image>
-    <_ip_UnifiedCompliancePolicyProperties xmlns="http://schemas.microsoft.com/sharepoint/v3" xsi:nil="true"/>
-    <ImageTagsTaxHTField xmlns="71af3243-3dd4-4a8d-8c0d-dd76da1f02a5">
-      <Terms xmlns="http://schemas.microsoft.com/office/infopath/2007/PartnerControls"/>
-    </ImageTagsTaxHTField>
-    <TaxCatchAll xmlns="230e9df3-be65-4c73-a93b-d1236ebd677e" xsi:nil="true"/>
-    <MediaServiceKeyPoints xmlns="71af3243-3dd4-4a8d-8c0d-dd76da1f02a5" xsi:nil="true"/>
-  </documentManagement>
-</p:properties>
+<b:Sources xmlns:b="http://schemas.openxmlformats.org/officeDocument/2006/bibliography" xmlns="http://schemas.openxmlformats.org/officeDocument/2006/bibliography" SelectedStyle="/APASixthEditionOfficeOnline.xsl" StyleName="APA" Version="6"/>
 </file>
 
 <file path=customXml/item2.xml><?xml version="1.0" encoding="utf-8"?>
+<?mso-contentType ?>
+<FormTemplates xmlns="http://schemas.microsoft.com/sharepoint/v3/contenttype/forms">
+  <Display>DocumentLibraryForm</Display>
+  <Edit>DocumentLibraryForm</Edit>
+  <New>DocumentLibraryForm</New>
+</FormTemplates>
+</file>
+
+<file path=customXml/item3.xml><?xml version="1.0" encoding="utf-8"?>
 <ct:contentTypeSchema xmlns:ct="http://schemas.microsoft.com/office/2006/metadata/contentType" xmlns:ma="http://schemas.microsoft.com/office/2006/metadata/properties/metaAttributes" ct:_="" ma:_="" ma:contentTypeName="Document" ma:contentTypeID="0x01010079F111ED35F8CC479449609E8A0923A6" ma:contentTypeVersion="26" ma:contentTypeDescription="Create a new document." ma:contentTypeScope="" ma:versionID="ac37c1753acd5e330d2062ccec26ea66">
   <xsd:schema xmlns:xsd="http://www.w3.org/2001/XMLSchema" xmlns:xs="http://www.w3.org/2001/XMLSchema" xmlns:p="http://schemas.microsoft.com/office/2006/metadata/properties" xmlns:ns1="http://schemas.microsoft.com/sharepoint/v3" xmlns:ns2="71af3243-3dd4-4a8d-8c0d-dd76da1f02a5" xmlns:ns3="16c05727-aa75-4e4a-9b5f-8a80a1165891" xmlns:ns4="230e9df3-be65-4c73-a93b-d1236ebd677e" targetNamespace="http://schemas.microsoft.com/office/2006/metadata/properties" ma:root="true" ma:fieldsID="3b340c7101c92c5120abd06486f94548" ns1:_="" ns2:_="" ns3:_="" ns4:_="">
     <xsd:import namespace="http://schemas.microsoft.com/sharepoint/v3"/>
@@ -7300,32 +7332,43 @@
 </ct:contentTypeSchema>
 </file>
 
-<file path=customXml/item3.xml><?xml version="1.0" encoding="utf-8"?>
-<?mso-contentType ?>
-<FormTemplates xmlns="http://schemas.microsoft.com/sharepoint/v3/contenttype/forms">
-  <Display>DocumentLibraryForm</Display>
-  <Edit>DocumentLibraryForm</Edit>
-  <New>DocumentLibraryForm</New>
-</FormTemplates>
-</file>
-
 <file path=customXml/item4.xml><?xml version="1.0" encoding="utf-8"?>
-<b:Sources xmlns:b="http://schemas.openxmlformats.org/officeDocument/2006/bibliography" xmlns="http://schemas.openxmlformats.org/officeDocument/2006/bibliography" SelectedStyle="/APASixthEditionOfficeOnline.xsl" StyleName="APA" Version="6"/>
+<p:properties xmlns:p="http://schemas.microsoft.com/office/2006/metadata/properties" xmlns:xsi="http://www.w3.org/2001/XMLSchema-instance" xmlns:pc="http://schemas.microsoft.com/office/infopath/2007/PartnerControls">
+  <documentManagement>
+    <Background xmlns="71af3243-3dd4-4a8d-8c0d-dd76da1f02a5">false</Background>
+    <Status xmlns="71af3243-3dd4-4a8d-8c0d-dd76da1f02a5">Not started</Status>
+    <_ip_UnifiedCompliancePolicyUIAction xmlns="http://schemas.microsoft.com/sharepoint/v3" xsi:nil="true"/>
+    <Image xmlns="71af3243-3dd4-4a8d-8c0d-dd76da1f02a5">
+      <Url xsi:nil="true"/>
+      <Description xsi:nil="true"/>
+    </Image>
+    <_ip_UnifiedCompliancePolicyProperties xmlns="http://schemas.microsoft.com/sharepoint/v3" xsi:nil="true"/>
+    <ImageTagsTaxHTField xmlns="71af3243-3dd4-4a8d-8c0d-dd76da1f02a5">
+      <Terms xmlns="http://schemas.microsoft.com/office/infopath/2007/PartnerControls"/>
+    </ImageTagsTaxHTField>
+    <TaxCatchAll xmlns="230e9df3-be65-4c73-a93b-d1236ebd677e" xsi:nil="true"/>
+    <MediaServiceKeyPoints xmlns="71af3243-3dd4-4a8d-8c0d-dd76da1f02a5" xsi:nil="true"/>
+  </documentManagement>
+</p:properties>
 </file>
 
 <file path=customXml/itemProps1.xml><?xml version="1.0" encoding="utf-8"?>
-<ds:datastoreItem xmlns:ds="http://schemas.openxmlformats.org/officeDocument/2006/customXml" ds:itemID="{79541AF4-0605-4549-B594-5B1E9F6FC301}">
+<ds:datastoreItem xmlns:ds="http://schemas.openxmlformats.org/officeDocument/2006/customXml" ds:itemID="{EA32451A-8A52-884A-8415-DB8F2BB5E5A1}">
   <ds:schemaRefs>
-    <ds:schemaRef ds:uri="http://schemas.microsoft.com/office/2006/metadata/properties"/>
-    <ds:schemaRef ds:uri="http://schemas.microsoft.com/office/infopath/2007/PartnerControls"/>
-    <ds:schemaRef ds:uri="71af3243-3dd4-4a8d-8c0d-dd76da1f02a5"/>
-    <ds:schemaRef ds:uri="http://schemas.microsoft.com/sharepoint/v3"/>
-    <ds:schemaRef ds:uri="230e9df3-be65-4c73-a93b-d1236ebd677e"/>
+    <ds:schemaRef ds:uri="http://schemas.openxmlformats.org/officeDocument/2006/bibliography"/>
   </ds:schemaRefs>
 </ds:datastoreItem>
 </file>
 
 <file path=customXml/itemProps2.xml><?xml version="1.0" encoding="utf-8"?>
+<ds:datastoreItem xmlns:ds="http://schemas.openxmlformats.org/officeDocument/2006/customXml" ds:itemID="{D3FF1C84-DF90-42FE-AE11-AFF931E8FAE7}">
+  <ds:schemaRefs>
+    <ds:schemaRef ds:uri="http://schemas.microsoft.com/sharepoint/v3/contenttype/forms"/>
+  </ds:schemaRefs>
+</ds:datastoreItem>
+</file>
+
+<file path=customXml/itemProps3.xml><?xml version="1.0" encoding="utf-8"?>
 <ds:datastoreItem xmlns:ds="http://schemas.openxmlformats.org/officeDocument/2006/customXml" ds:itemID="{BC00A20C-2870-4772-8D78-C84273E380D6}">
   <ds:schemaRefs>
     <ds:schemaRef ds:uri="http://schemas.microsoft.com/office/2006/metadata/contentType"/>
@@ -7346,18 +7389,14 @@
 </ds:datastoreItem>
 </file>
 
-<file path=customXml/itemProps3.xml><?xml version="1.0" encoding="utf-8"?>
-<ds:datastoreItem xmlns:ds="http://schemas.openxmlformats.org/officeDocument/2006/customXml" ds:itemID="{D3FF1C84-DF90-42FE-AE11-AFF931E8FAE7}">
+<file path=customXml/itemProps4.xml><?xml version="1.0" encoding="utf-8"?>
+<ds:datastoreItem xmlns:ds="http://schemas.openxmlformats.org/officeDocument/2006/customXml" ds:itemID="{79541AF4-0605-4549-B594-5B1E9F6FC301}">
   <ds:schemaRefs>
-    <ds:schemaRef ds:uri="http://schemas.microsoft.com/sharepoint/v3/contenttype/forms"/>
-  </ds:schemaRefs>
-</ds:datastoreItem>
-</file>
-
-<file path=customXml/itemProps4.xml><?xml version="1.0" encoding="utf-8"?>
-<ds:datastoreItem xmlns:ds="http://schemas.openxmlformats.org/officeDocument/2006/customXml" ds:itemID="{EA32451A-8A52-884A-8415-DB8F2BB5E5A1}">
-  <ds:schemaRefs>
-    <ds:schemaRef ds:uri="http://schemas.openxmlformats.org/officeDocument/2006/bibliography"/>
+    <ds:schemaRef ds:uri="http://schemas.microsoft.com/office/2006/metadata/properties"/>
+    <ds:schemaRef ds:uri="http://schemas.microsoft.com/office/infopath/2007/PartnerControls"/>
+    <ds:schemaRef ds:uri="71af3243-3dd4-4a8d-8c0d-dd76da1f02a5"/>
+    <ds:schemaRef ds:uri="http://schemas.microsoft.com/sharepoint/v3"/>
+    <ds:schemaRef ds:uri="230e9df3-be65-4c73-a93b-d1236ebd677e"/>
   </ds:schemaRefs>
 </ds:datastoreItem>
 </file>

</xml_diff>